<commit_message>
Restore short-term needs framing activity
</commit_message>
<xml_diff>
--- a/NASIJ_template_assessment_attuale.docx
+++ b/NASIJ_template_assessment_attuale.docx
@@ -273,7 +273,7 @@
           <w:rFonts w:ascii="Calibri" w:hAnsi="Calibri"/>
           <w:sz w:val="20"/>
         </w:rPr>
-        <w:t>5. Obiettivo principale a medio-lungo termine - domanda aperta</w:t>
+        <w:t>5. Framing dei bisogni a breve termine - domanda aperta</w:t>
       </w:r>
     </w:p>
     <w:p>
@@ -286,7 +286,7 @@
           <w:rFonts w:ascii="Calibri" w:hAnsi="Calibri"/>
           <w:sz w:val="20"/>
         </w:rPr>
-        <w:t>6. Punti di forza e impatto sul territorio - domanda aperta</w:t>
+        <w:t>6. Obiettivo principale a medio-lungo termine - domanda aperta</w:t>
       </w:r>
     </w:p>
     <w:p>
@@ -299,7 +299,20 @@
           <w:rFonts w:ascii="Calibri" w:hAnsi="Calibri"/>
           <w:sz w:val="20"/>
         </w:rPr>
-        <w:t>7. Risorse e contributi per il network NASIJ - domanda aperta</w:t>
+        <w:t>7. Punti di forza e impatto sul territorio - domanda aperta</w:t>
+      </w:r>
+    </w:p>
+    <w:p>
+      <w:pPr>
+        <w:pStyle w:val="Numeroelenco"/>
+        <w:spacing w:after="40"/>
+      </w:pPr>
+      <w:r>
+        <w:rPr>
+          <w:rFonts w:ascii="Calibri" w:hAnsi="Calibri"/>
+          <w:sz w:val="20"/>
+        </w:rPr>
+        <w:t>8. Risorse e contributi per il network NASIJ - domanda aperta</w:t>
       </w:r>
     </w:p>
     <w:p>
@@ -3773,7 +3786,7 @@
           <w:color w:val="1F4D78"/>
           <w:sz w:val="30"/>
         </w:rPr>
-        <w:t>5. Obiettivo principale a medio-lungo termine</w:t>
+        <w:t>5. Framing dei bisogni a breve termine</w:t>
       </w:r>
     </w:p>
     <w:p>
@@ -3795,7 +3808,7 @@
           <w:color w:val="222222"/>
           <w:sz w:val="20"/>
         </w:rPr>
-        <w:t>Identificare un obiettivo principale che l'organizzazione intende raggiungere o preparare nei prossimi 1-5 anni o più.</w:t>
+        <w:t>Questa sezione serve a trasformare l'obiettivo e le challenge a breve termine in bisogni operativi, azioni possibili e forme di supporto.</w:t>
       </w:r>
     </w:p>
     <w:p>
@@ -3818,6 +3831,28 @@
           <w:sz w:val="20"/>
         </w:rPr>
         <w:t>domanda aperta</w:t>
+      </w:r>
+    </w:p>
+    <w:p>
+      <w:pPr>
+        <w:spacing w:after="80"/>
+      </w:pPr>
+      <w:r>
+        <w:rPr>
+          <w:rFonts w:ascii="Calibri" w:hAnsi="Calibri"/>
+          <w:b/>
+          <w:color w:val="555555"/>
+          <w:sz w:val="20"/>
+        </w:rPr>
+        <w:t xml:space="preserve">Collegata a: </w:t>
+      </w:r>
+      <w:r>
+        <w:rPr>
+          <w:rFonts w:ascii="Calibri" w:hAnsi="Calibri"/>
+          <w:color w:val="222222"/>
+          <w:sz w:val="20"/>
+        </w:rPr>
+        <w:t>Risposte/priorita dell'attivita: short-priorities</w:t>
       </w:r>
     </w:p>
     <w:p>
@@ -3832,7 +3867,7 @@
           <w:color w:val="2E74B5"/>
           <w:sz w:val="24"/>
         </w:rPr>
-        <w:t>1. Obiettivo principale</w:t>
+        <w:t>1. Supporto immediato</w:t>
       </w:r>
     </w:p>
     <w:p>
@@ -3854,7 +3889,203 @@
           <w:color w:val="222222"/>
           <w:sz w:val="20"/>
         </w:rPr>
-        <w:t>Pensate ai prossimi 1-5 anni o più. Qual è l'obiettivo principale di sostenibilità, miglioramento, sviluppo o trasformazione che potrebbe diventare più rilevante per la vostra organizzazione, il vostro settore o il vostro territorio?</w:t>
+        <w:t>Quale tipo di supporto aiuterebbe la vostra organizzazione a raggiungere l'obiettivo a breve termine e ad affrontare le challenge più urgenti?</w:t>
+      </w:r>
+    </w:p>
+    <w:p>
+      <w:pPr>
+        <w:spacing w:after="80"/>
+      </w:pPr>
+      <w:r>
+        <w:rPr>
+          <w:rFonts w:ascii="Calibri" w:hAnsi="Calibri"/>
+          <w:b/>
+          <w:color w:val="555555"/>
+          <w:sz w:val="20"/>
+        </w:rPr>
+        <w:t xml:space="preserve">Obbligatoria: </w:t>
+      </w:r>
+      <w:r>
+        <w:rPr>
+          <w:rFonts w:ascii="Calibri" w:hAnsi="Calibri"/>
+          <w:color w:val="222222"/>
+          <w:sz w:val="20"/>
+        </w:rPr>
+        <w:t>Si</w:t>
+      </w:r>
+    </w:p>
+    <w:p>
+      <w:pPr>
+        <w:spacing w:after="20"/>
+      </w:pPr>
+      <w:r>
+        <w:rPr>
+          <w:rFonts w:ascii="Calibri" w:hAnsi="Calibri"/>
+          <w:color w:val="A0A0A0"/>
+          <w:sz w:val="18"/>
+        </w:rPr>
+        <w:t>__________________________________________________________________________________</w:t>
+      </w:r>
+    </w:p>
+    <w:p>
+      <w:pPr>
+        <w:spacing w:after="20"/>
+      </w:pPr>
+      <w:r>
+        <w:rPr>
+          <w:rFonts w:ascii="Calibri" w:hAnsi="Calibri"/>
+          <w:color w:val="A0A0A0"/>
+          <w:sz w:val="18"/>
+        </w:rPr>
+        <w:t>__________________________________________________________________________________</w:t>
+      </w:r>
+    </w:p>
+    <w:p>
+      <w:pPr>
+        <w:spacing w:after="20"/>
+      </w:pPr>
+      <w:r>
+        <w:rPr>
+          <w:rFonts w:ascii="Calibri" w:hAnsi="Calibri"/>
+          <w:color w:val="A0A0A0"/>
+          <w:sz w:val="18"/>
+        </w:rPr>
+        <w:t>__________________________________________________________________________________</w:t>
+      </w:r>
+    </w:p>
+    <w:p>
+      <w:pPr>
+        <w:pStyle w:val="Titolo2"/>
+        <w:spacing w:before="160" w:after="40"/>
+      </w:pPr>
+      <w:r>
+        <w:rPr>
+          <w:rFonts w:ascii="Calibri" w:hAnsi="Calibri"/>
+          <w:b/>
+          <w:color w:val="2E74B5"/>
+          <w:sz w:val="24"/>
+        </w:rPr>
+        <w:t>2. Risorse pratiche</w:t>
+      </w:r>
+    </w:p>
+    <w:p>
+      <w:pPr>
+        <w:spacing w:after="80"/>
+      </w:pPr>
+      <w:r>
+        <w:rPr>
+          <w:rFonts w:ascii="Calibri" w:hAnsi="Calibri"/>
+          <w:b/>
+          <w:color w:val="555555"/>
+          <w:sz w:val="20"/>
+        </w:rPr>
+        <w:t xml:space="preserve">Domanda: </w:t>
+      </w:r>
+      <w:r>
+        <w:rPr>
+          <w:rFonts w:ascii="Calibri" w:hAnsi="Calibri"/>
+          <w:color w:val="222222"/>
+          <w:sz w:val="20"/>
+        </w:rPr>
+        <w:t>Quali strumenti, conoscenze, formazioni o supporto tecnico sarebbero utili nei prossimi 6-12 mesi?</w:t>
+      </w:r>
+    </w:p>
+    <w:p>
+      <w:pPr>
+        <w:spacing w:after="80"/>
+      </w:pPr>
+      <w:r>
+        <w:rPr>
+          <w:rFonts w:ascii="Calibri" w:hAnsi="Calibri"/>
+          <w:b/>
+          <w:color w:val="555555"/>
+          <w:sz w:val="20"/>
+        </w:rPr>
+        <w:t xml:space="preserve">Obbligatoria: </w:t>
+      </w:r>
+      <w:r>
+        <w:rPr>
+          <w:rFonts w:ascii="Calibri" w:hAnsi="Calibri"/>
+          <w:color w:val="222222"/>
+          <w:sz w:val="20"/>
+        </w:rPr>
+        <w:t>Si</w:t>
+      </w:r>
+    </w:p>
+    <w:p>
+      <w:pPr>
+        <w:spacing w:after="20"/>
+      </w:pPr>
+      <w:r>
+        <w:rPr>
+          <w:rFonts w:ascii="Calibri" w:hAnsi="Calibri"/>
+          <w:color w:val="A0A0A0"/>
+          <w:sz w:val="18"/>
+        </w:rPr>
+        <w:t>__________________________________________________________________________________</w:t>
+      </w:r>
+    </w:p>
+    <w:p>
+      <w:pPr>
+        <w:spacing w:after="20"/>
+      </w:pPr>
+      <w:r>
+        <w:rPr>
+          <w:rFonts w:ascii="Calibri" w:hAnsi="Calibri"/>
+          <w:color w:val="A0A0A0"/>
+          <w:sz w:val="18"/>
+        </w:rPr>
+        <w:t>__________________________________________________________________________________</w:t>
+      </w:r>
+    </w:p>
+    <w:p>
+      <w:pPr>
+        <w:spacing w:after="20"/>
+      </w:pPr>
+      <w:r>
+        <w:rPr>
+          <w:rFonts w:ascii="Calibri" w:hAnsi="Calibri"/>
+          <w:color w:val="A0A0A0"/>
+          <w:sz w:val="18"/>
+        </w:rPr>
+        <w:t>__________________________________________________________________________________</w:t>
+      </w:r>
+    </w:p>
+    <w:p>
+      <w:pPr>
+        <w:pStyle w:val="Titolo2"/>
+        <w:spacing w:before="160" w:after="40"/>
+      </w:pPr>
+      <w:r>
+        <w:rPr>
+          <w:rFonts w:ascii="Calibri" w:hAnsi="Calibri"/>
+          <w:b/>
+          <w:color w:val="2E74B5"/>
+          <w:sz w:val="24"/>
+        </w:rPr>
+        <w:t>3. Primo passo</w:t>
+      </w:r>
+    </w:p>
+    <w:p>
+      <w:pPr>
+        <w:spacing w:after="80"/>
+      </w:pPr>
+      <w:r>
+        <w:rPr>
+          <w:rFonts w:ascii="Calibri" w:hAnsi="Calibri"/>
+          <w:b/>
+          <w:color w:val="555555"/>
+          <w:sz w:val="20"/>
+        </w:rPr>
+        <w:t xml:space="preserve">Domanda: </w:t>
+      </w:r>
+      <w:r>
+        <w:rPr>
+          <w:rFonts w:ascii="Calibri" w:hAnsi="Calibri"/>
+          <w:color w:val="222222"/>
+          <w:sz w:val="20"/>
+        </w:rPr>
+        <w:t>Quale potrebbe essere un primo passo realistico per iniziare a lavorare su questo obiettivo?</w:t>
       </w:r>
     </w:p>
     <w:p>
@@ -3935,7 +4166,7 @@
           <w:color w:val="1F4D78"/>
           <w:sz w:val="30"/>
         </w:rPr>
-        <w:t>6. Punti di forza e impatto sul territorio</w:t>
+        <w:t>6. Obiettivo principale a medio-lungo termine</w:t>
       </w:r>
     </w:p>
     <w:p>
@@ -3957,7 +4188,7 @@
           <w:color w:val="222222"/>
           <w:sz w:val="20"/>
         </w:rPr>
-        <w:t>Questa sezione serve a identificare i principali punti di forza dell'organizzazione, gli aspetti da valorizzare e il contributo positivo che può generare sul territorio, sulla comunità locale e sul network NASIJ.</w:t>
+        <w:t>Identificare un obiettivo principale che l'organizzazione intende raggiungere o preparare nei prossimi 1-5 anni o più.</w:t>
       </w:r>
     </w:p>
     <w:p>
@@ -3994,7 +4225,7 @@
           <w:color w:val="2E74B5"/>
           <w:sz w:val="24"/>
         </w:rPr>
-        <w:t>1. Punti di forza e impatto sul territorio</w:t>
+        <w:t>1. Obiettivo principale</w:t>
       </w:r>
     </w:p>
     <w:p>
@@ -4016,7 +4247,7 @@
           <w:color w:val="222222"/>
           <w:sz w:val="20"/>
         </w:rPr>
-        <w:t>Quali sono i principali punti di forza della vostra azienda, organizzazione o attività? Quali elementi pensate debbano essere riconosciuti, rafforzati o comunicati meglio? Che tipo di impatto positivo pensate di poter generare sul territorio o sulla comunità locale?</w:t>
+        <w:t>Pensate ai prossimi 1-5 anni o più. Qual è l'obiettivo principale di sostenibilità, miglioramento, sviluppo o trasformazione che potrebbe diventare più rilevante per la vostra organizzazione, il vostro settore o il vostro territorio?</w:t>
       </w:r>
     </w:p>
     <w:p>
@@ -4039,28 +4270,6 @@
           <w:sz w:val="20"/>
         </w:rPr>
         <w:t>Si</w:t>
-      </w:r>
-    </w:p>
-    <w:p>
-      <w:pPr>
-        <w:spacing w:after="80"/>
-      </w:pPr>
-      <w:r>
-        <w:rPr>
-          <w:rFonts w:ascii="Calibri" w:hAnsi="Calibri"/>
-          <w:b/>
-          <w:color w:val="555555"/>
-          <w:sz w:val="20"/>
-        </w:rPr>
-        <w:t xml:space="preserve">Placeholder: </w:t>
-      </w:r>
-      <w:r>
-        <w:rPr>
-          <w:rFonts w:ascii="Calibri" w:hAnsi="Calibri"/>
-          <w:color w:val="222222"/>
-          <w:sz w:val="20"/>
-        </w:rPr>
-        <w:t>Potete fare riferimento, ad esempio, a competenze artigianali, know-how tecnico, qualità dei prodotti, capacità produttiva, radicamento territoriale, relazioni locali, pratiche sostenibili già esistenti, cultura del lavoro, innovazione, identità aziendale, potenziale di collaborazione, opportunità occupazionali, trasmissione di competenze, inclusione sociale o contributo allo sviluppo della comunità locale.</w:t>
       </w:r>
     </w:p>
     <w:p>
@@ -4119,7 +4328,7 @@
           <w:color w:val="1F4D78"/>
           <w:sz w:val="30"/>
         </w:rPr>
-        <w:t>7. Risorse e contributi per il network NASIJ</w:t>
+        <w:t>7. Punti di forza e impatto sul territorio</w:t>
       </w:r>
     </w:p>
     <w:p>
@@ -4141,7 +4350,7 @@
           <w:color w:val="222222"/>
           <w:sz w:val="20"/>
         </w:rPr>
-        <w:t>Questa sezione serve a identificare cosa ogni organizzazione potrebbe condividere o mettere a disposizione delle altre realtà del network NASIJ, indipendentemente dagli obiettivi o dalle challenge indicate nelle sezioni precedenti.</w:t>
+        <w:t>Questa sezione serve a identificare i principali punti di forza dell'organizzazione, gli aspetti da valorizzare e il contributo positivo che può generare sul territorio, sulla comunità locale e sul network NASIJ.</w:t>
       </w:r>
     </w:p>
     <w:p>
@@ -4178,7 +4387,7 @@
           <w:color w:val="2E74B5"/>
           <w:sz w:val="24"/>
         </w:rPr>
-        <w:t>1. Risorse e contributi</w:t>
+        <w:t>1. Punti di forza e impatto sul territorio</w:t>
       </w:r>
     </w:p>
     <w:p>
@@ -4200,7 +4409,7 @@
           <w:color w:val="222222"/>
           <w:sz w:val="20"/>
         </w:rPr>
-        <w:t>Quali risorse, competenze, esperienze, strumenti, conoscenze, spazi, servizi o opportunità la vostra organizzazione potrebbe mettere a disposizione delle altre aziende o dei soggetti del network NASIJ?</w:t>
+        <w:t>Quali sono i principali punti di forza della vostra azienda, organizzazione o attività? Quali elementi pensate debbano essere riconosciuti, rafforzati o comunicati meglio? Che tipo di impatto positivo pensate di poter generare sul territorio o sulla comunità locale?</w:t>
       </w:r>
     </w:p>
     <w:p>
@@ -4244,7 +4453,7 @@
           <w:color w:val="222222"/>
           <w:sz w:val="20"/>
         </w:rPr>
-        <w:t>Potete indicare, ad esempio, competenze tecniche, esperienze produttive, conoscenze locali, capacità formative, disponibilità a collaborare, accesso a macchinari, spazi, contatti, buone pratiche, casi studio o altre risorse utili.</w:t>
+        <w:t>Potete fare riferimento, ad esempio, a competenze artigianali, know-how tecnico, qualità dei prodotti, capacità produttiva, radicamento territoriale, relazioni locali, pratiche sostenibili già esistenti, cultura del lavoro, innovazione, identità aziendale, potenziale di collaborazione, opportunità occupazionali, trasmissione di competenze, inclusione sociale o contributo allo sviluppo della comunità locale.</w:t>
       </w:r>
     </w:p>
     <w:p>
@@ -4303,6 +4512,190 @@
           <w:color w:val="1F4D78"/>
           <w:sz w:val="30"/>
         </w:rPr>
+        <w:t>8. Risorse e contributi per il network NASIJ</w:t>
+      </w:r>
+    </w:p>
+    <w:p>
+      <w:pPr>
+        <w:spacing w:after="80"/>
+      </w:pPr>
+      <w:r>
+        <w:rPr>
+          <w:rFonts w:ascii="Calibri" w:hAnsi="Calibri"/>
+          <w:b/>
+          <w:color w:val="555555"/>
+          <w:sz w:val="20"/>
+        </w:rPr>
+        <w:t xml:space="preserve">Descrizione: </w:t>
+      </w:r>
+      <w:r>
+        <w:rPr>
+          <w:rFonts w:ascii="Calibri" w:hAnsi="Calibri"/>
+          <w:color w:val="222222"/>
+          <w:sz w:val="20"/>
+        </w:rPr>
+        <w:t>Questa sezione serve a identificare cosa ogni organizzazione potrebbe condividere o mettere a disposizione delle altre realtà del network NASIJ, indipendentemente dagli obiettivi o dalle challenge indicate nelle sezioni precedenti.</w:t>
+      </w:r>
+    </w:p>
+    <w:p>
+      <w:pPr>
+        <w:spacing w:after="80"/>
+      </w:pPr>
+      <w:r>
+        <w:rPr>
+          <w:rFonts w:ascii="Calibri" w:hAnsi="Calibri"/>
+          <w:b/>
+          <w:color w:val="555555"/>
+          <w:sz w:val="20"/>
+        </w:rPr>
+        <w:t xml:space="preserve">Tipo di risposta: </w:t>
+      </w:r>
+      <w:r>
+        <w:rPr>
+          <w:rFonts w:ascii="Calibri" w:hAnsi="Calibri"/>
+          <w:color w:val="222222"/>
+          <w:sz w:val="20"/>
+        </w:rPr>
+        <w:t>domanda aperta</w:t>
+      </w:r>
+    </w:p>
+    <w:p>
+      <w:pPr>
+        <w:pStyle w:val="Titolo2"/>
+        <w:spacing w:before="160" w:after="40"/>
+      </w:pPr>
+      <w:r>
+        <w:rPr>
+          <w:rFonts w:ascii="Calibri" w:hAnsi="Calibri"/>
+          <w:b/>
+          <w:color w:val="2E74B5"/>
+          <w:sz w:val="24"/>
+        </w:rPr>
+        <w:t>1. Risorse e contributi</w:t>
+      </w:r>
+    </w:p>
+    <w:p>
+      <w:pPr>
+        <w:spacing w:after="80"/>
+      </w:pPr>
+      <w:r>
+        <w:rPr>
+          <w:rFonts w:ascii="Calibri" w:hAnsi="Calibri"/>
+          <w:b/>
+          <w:color w:val="555555"/>
+          <w:sz w:val="20"/>
+        </w:rPr>
+        <w:t xml:space="preserve">Domanda: </w:t>
+      </w:r>
+      <w:r>
+        <w:rPr>
+          <w:rFonts w:ascii="Calibri" w:hAnsi="Calibri"/>
+          <w:color w:val="222222"/>
+          <w:sz w:val="20"/>
+        </w:rPr>
+        <w:t>Quali risorse, competenze, esperienze, strumenti, conoscenze, spazi, servizi o opportunità la vostra organizzazione potrebbe mettere a disposizione delle altre aziende o dei soggetti del network NASIJ?</w:t>
+      </w:r>
+    </w:p>
+    <w:p>
+      <w:pPr>
+        <w:spacing w:after="80"/>
+      </w:pPr>
+      <w:r>
+        <w:rPr>
+          <w:rFonts w:ascii="Calibri" w:hAnsi="Calibri"/>
+          <w:b/>
+          <w:color w:val="555555"/>
+          <w:sz w:val="20"/>
+        </w:rPr>
+        <w:t xml:space="preserve">Obbligatoria: </w:t>
+      </w:r>
+      <w:r>
+        <w:rPr>
+          <w:rFonts w:ascii="Calibri" w:hAnsi="Calibri"/>
+          <w:color w:val="222222"/>
+          <w:sz w:val="20"/>
+        </w:rPr>
+        <w:t>Si</w:t>
+      </w:r>
+    </w:p>
+    <w:p>
+      <w:pPr>
+        <w:spacing w:after="80"/>
+      </w:pPr>
+      <w:r>
+        <w:rPr>
+          <w:rFonts w:ascii="Calibri" w:hAnsi="Calibri"/>
+          <w:b/>
+          <w:color w:val="555555"/>
+          <w:sz w:val="20"/>
+        </w:rPr>
+        <w:t xml:space="preserve">Placeholder: </w:t>
+      </w:r>
+      <w:r>
+        <w:rPr>
+          <w:rFonts w:ascii="Calibri" w:hAnsi="Calibri"/>
+          <w:color w:val="222222"/>
+          <w:sz w:val="20"/>
+        </w:rPr>
+        <w:t>Potete indicare, ad esempio, competenze tecniche, esperienze produttive, conoscenze locali, capacità formative, disponibilità a collaborare, accesso a macchinari, spazi, contatti, buone pratiche, casi studio o altre risorse utili.</w:t>
+      </w:r>
+    </w:p>
+    <w:p>
+      <w:pPr>
+        <w:spacing w:after="20"/>
+      </w:pPr>
+      <w:r>
+        <w:rPr>
+          <w:rFonts w:ascii="Calibri" w:hAnsi="Calibri"/>
+          <w:color w:val="A0A0A0"/>
+          <w:sz w:val="18"/>
+        </w:rPr>
+        <w:t>__________________________________________________________________________________</w:t>
+      </w:r>
+    </w:p>
+    <w:p>
+      <w:pPr>
+        <w:spacing w:after="20"/>
+      </w:pPr>
+      <w:r>
+        <w:rPr>
+          <w:rFonts w:ascii="Calibri" w:hAnsi="Calibri"/>
+          <w:color w:val="A0A0A0"/>
+          <w:sz w:val="18"/>
+        </w:rPr>
+        <w:t>__________________________________________________________________________________</w:t>
+      </w:r>
+    </w:p>
+    <w:p>
+      <w:pPr>
+        <w:spacing w:after="20"/>
+      </w:pPr>
+      <w:r>
+        <w:rPr>
+          <w:rFonts w:ascii="Calibri" w:hAnsi="Calibri"/>
+          <w:color w:val="A0A0A0"/>
+          <w:sz w:val="18"/>
+        </w:rPr>
+        <w:t>__________________________________________________________________________________</w:t>
+      </w:r>
+    </w:p>
+    <w:p>
+      <w:r>
+        <w:br w:type="page"/>
+      </w:r>
+    </w:p>
+    <w:p>
+      <w:pPr>
+        <w:pStyle w:val="Titolo1"/>
+        <w:spacing w:before="240" w:after="80"/>
+      </w:pPr>
+      <w:r>
+        <w:rPr>
+          <w:rFonts w:ascii="Calibri" w:hAnsi="Calibri"/>
+          <w:b/>
+          <w:color w:val="1F4D78"/>
+          <w:sz w:val="30"/>
+        </w:rPr>
         <w:t>Restituzione e report finale</w:t>
       </w:r>
     </w:p>
@@ -4588,6 +4981,20 @@
           <w:sz w:val="18"/>
         </w:rPr>
         <w:t>Priorità a breve termine</w:t>
+      </w:r>
+    </w:p>
+    <w:p>
+      <w:pPr>
+        <w:pStyle w:val="Puntoelenco2"/>
+        <w:spacing w:after="20"/>
+        <w:ind w:left="560"/>
+      </w:pPr>
+      <w:r>
+        <w:rPr>
+          <w:rFonts w:ascii="Calibri" w:hAnsi="Calibri"/>
+          <w:sz w:val="18"/>
+        </w:rPr>
+        <w:t>Framing dei bisogni a breve termine</w:t>
       </w:r>
     </w:p>
     <w:p>

</xml_diff>